<commit_message>
Deploying to gh-pages from @ rhenoa24/Resume2025@f8b12324c3d8339360eea5b1b82128e20ee2b52f 🚀
</commit_message>
<xml_diff>
--- a/Bautista_Resume_2025.docx
+++ b/Bautista_Resume_2025.docx
@@ -5025,7 +5025,7 @@
                 <w:sz w:val="20"/>
                 <w:szCs w:val="20"/>
               </w:rPr>
-              <w:t xml:space="preserve"> for local and international clients across the streaming and creative community.</w:t>
+              <w:t xml:space="preserve"> for local and international clients across the streaming and online creative communities.</w:t>
             </w:r>
           </w:p>
           <w:p>
@@ -5036,17 +5036,29 @@
               </w:numPr>
               <w:rPr>
                 <w:rFonts w:ascii="Inter" w:hAnsi="Inter"/>
-                <w:sz w:val="20"/>
-                <w:szCs w:val="20"/>
-              </w:rPr>
-            </w:pPr>
-            <w:r>
-              <w:rPr>
-                <w:rFonts w:ascii="Inter" w:hAnsi="Inter"/>
-                <w:sz w:val="20"/>
-                <w:szCs w:val="20"/>
-              </w:rPr>
-              <w:t>Adapted illustration styles to match client branding, personality, and platform requirements.</w:t>
+                <w:b/>
+                <w:bCs/>
+                <w:sz w:val="20"/>
+                <w:szCs w:val="20"/>
+              </w:rPr>
+            </w:pPr>
+            <w:r>
+              <w:rPr>
+                <w:rFonts w:ascii="Inter" w:hAnsi="Inter"/>
+                <w:sz w:val="20"/>
+                <w:szCs w:val="20"/>
+              </w:rPr>
+              <w:t xml:space="preserve">Adapted illustration styles to match </w:t>
+            </w:r>
+            <w:r>
+              <w:rPr>
+                <w:rFonts w:ascii="Inter" w:hAnsi="Inter"/>
+                <w:b/>
+                <w:bCs/>
+                <w:sz w:val="20"/>
+                <w:szCs w:val="20"/>
+              </w:rPr>
+              <w:t>client branding, personality, and platform requirements.</w:t>
             </w:r>
           </w:p>
           <w:p>
@@ -5067,7 +5079,181 @@
                 <w:sz w:val="20"/>
                 <w:szCs w:val="20"/>
               </w:rPr>
-              <w:t>Managed client communication, revisions, and deadlines while maintaining consistent quality at high volume.</w:t>
+              <w:t xml:space="preserve">Managed </w:t>
+            </w:r>
+            <w:r>
+              <w:rPr>
+                <w:rFonts w:ascii="Inter" w:hAnsi="Inter"/>
+                <w:b/>
+                <w:bCs/>
+                <w:sz w:val="20"/>
+                <w:szCs w:val="20"/>
+              </w:rPr>
+              <w:t>client communication, revisions, and project deadlines</w:t>
+            </w:r>
+            <w:r>
+              <w:rPr>
+                <w:rFonts w:ascii="Inter" w:hAnsi="Inter"/>
+                <w:sz w:val="20"/>
+                <w:szCs w:val="20"/>
+              </w:rPr>
+              <w:t>, maintaining consistent quality while handling a high volume of commissions.</w:t>
+            </w:r>
+          </w:p>
+          <w:p>
+            <w:pPr>
+              <w:numPr>
+                <w:ilvl w:val="0"/>
+                <w:numId w:val="5"/>
+              </w:numPr>
+              <w:rPr>
+                <w:rFonts w:ascii="Inter" w:hAnsi="Inter"/>
+                <w:sz w:val="20"/>
+                <w:szCs w:val="20"/>
+              </w:rPr>
+            </w:pPr>
+            <w:r>
+              <w:rPr>
+                <w:rFonts w:ascii="Inter" w:hAnsi="Inter"/>
+                <w:sz w:val="20"/>
+                <w:szCs w:val="20"/>
+              </w:rPr>
+              <w:t xml:space="preserve">Built an </w:t>
+            </w:r>
+            <w:r>
+              <w:rPr>
+                <w:rFonts w:ascii="Inter" w:hAnsi="Inter"/>
+                <w:b/>
+                <w:bCs/>
+                <w:sz w:val="20"/>
+                <w:szCs w:val="20"/>
+              </w:rPr>
+              <w:t>independent online presence and client pipeline</w:t>
+            </w:r>
+            <w:r>
+              <w:rPr>
+                <w:rFonts w:ascii="Inter" w:hAnsi="Inter"/>
+                <w:sz w:val="20"/>
+                <w:szCs w:val="20"/>
+              </w:rPr>
+              <w:t xml:space="preserve"> through self-marketing, referrals, and community engagement.</w:t>
+            </w:r>
+          </w:p>
+          <w:p>
+            <w:pPr>
+              <w:numPr>
+                <w:ilvl w:val="0"/>
+                <w:numId w:val="5"/>
+              </w:numPr>
+              <w:rPr>
+                <w:rFonts w:ascii="Inter" w:hAnsi="Inter"/>
+                <w:sz w:val="20"/>
+                <w:szCs w:val="20"/>
+              </w:rPr>
+            </w:pPr>
+            <w:r>
+              <w:rPr>
+                <w:rFonts w:ascii="Inter" w:hAnsi="Inter"/>
+                <w:sz w:val="20"/>
+                <w:szCs w:val="20"/>
+              </w:rPr>
+              <w:t xml:space="preserve">Maintained and managed multiple </w:t>
+            </w:r>
+            <w:r>
+              <w:rPr>
+                <w:rFonts w:ascii="Inter" w:hAnsi="Inter"/>
+                <w:b/>
+                <w:bCs/>
+                <w:sz w:val="20"/>
+                <w:szCs w:val="20"/>
+              </w:rPr>
+              <w:t>social media platforms</w:t>
+            </w:r>
+            <w:r>
+              <w:rPr>
+                <w:rFonts w:ascii="Inter" w:hAnsi="Inter"/>
+                <w:sz w:val="20"/>
+                <w:szCs w:val="20"/>
+              </w:rPr>
+              <w:t xml:space="preserve"> (Facebook, Twitter/X, Reddit, Tumblr, Instagram) to showcase work and attract new clients.</w:t>
+            </w:r>
+          </w:p>
+          <w:p>
+            <w:pPr>
+              <w:numPr>
+                <w:ilvl w:val="0"/>
+                <w:numId w:val="5"/>
+              </w:numPr>
+              <w:rPr>
+                <w:rFonts w:ascii="Inter" w:hAnsi="Inter"/>
+                <w:sz w:val="20"/>
+                <w:szCs w:val="20"/>
+              </w:rPr>
+            </w:pPr>
+            <w:r>
+              <w:rPr>
+                <w:rFonts w:ascii="Inter" w:hAnsi="Inter"/>
+                <w:sz w:val="20"/>
+                <w:szCs w:val="20"/>
+              </w:rPr>
+              <w:t xml:space="preserve">Completed commissions ranging from </w:t>
+            </w:r>
+            <w:r>
+              <w:rPr>
+                <w:rFonts w:ascii="Inter" w:hAnsi="Inter"/>
+                <w:b/>
+                <w:bCs/>
+                <w:sz w:val="20"/>
+                <w:szCs w:val="20"/>
+              </w:rPr>
+              <w:t>character illustrations and vector logos to stream overlays and light video editing</w:t>
+            </w:r>
+            <w:r>
+              <w:rPr>
+                <w:rFonts w:ascii="Inter" w:hAnsi="Inter"/>
+                <w:sz w:val="20"/>
+                <w:szCs w:val="20"/>
+              </w:rPr>
+              <w:t>.</w:t>
+            </w:r>
+          </w:p>
+          <w:p>
+            <w:pPr>
+              <w:numPr>
+                <w:ilvl w:val="0"/>
+                <w:numId w:val="5"/>
+              </w:numPr>
+              <w:rPr>
+                <w:rFonts w:ascii="Inter" w:hAnsi="Inter"/>
+                <w:sz w:val="20"/>
+                <w:szCs w:val="20"/>
+              </w:rPr>
+            </w:pPr>
+            <w:r>
+              <w:rPr>
+                <w:rFonts w:ascii="Inter" w:hAnsi="Inter"/>
+                <w:sz w:val="20"/>
+                <w:szCs w:val="20"/>
+              </w:rPr>
+              <w:t xml:space="preserve">Developed strong </w:t>
+            </w:r>
+            <w:r>
+              <w:rPr>
+                <w:rFonts w:ascii="Inter" w:hAnsi="Inter"/>
+                <w:b/>
+                <w:bCs/>
+                <w:sz w:val="20"/>
+                <w:szCs w:val="20"/>
+              </w:rPr>
+              <w:t>client collaboration and feedback iteration skills</w:t>
+            </w:r>
+            <w:r>
+              <w:rPr>
+                <w:rFonts w:ascii="Inter" w:hAnsi="Inter"/>
+                <w:sz w:val="20"/>
+                <w:szCs w:val="20"/>
+              </w:rPr>
+              <w:t>, adapting designs based on revision cycles and evolving project requirements.</w:t>
             </w:r>
           </w:p>
           <w:p>
@@ -5439,6 +5625,79 @@
                 <w:t>https://www.youtube.com/watch?v=Ah7cQc5t_4M</w:t>
               </w:r>
             </w:hyperlink>
+          </w:p>
+          <w:p>
+            <w:pPr>
+              <w:pStyle w:val="ListParagraph"/>
+              <w:numPr>
+                <w:ilvl w:val="0"/>
+                <w:numId w:val="8"/>
+              </w:numPr>
+              <w:rPr>
+                <w:rFonts w:ascii="Inter" w:hAnsi="Inter"/>
+                <w:sz w:val="20"/>
+                <w:szCs w:val="20"/>
+              </w:rPr>
+            </w:pPr>
+            <w:r>
+              <w:rPr>
+                <w:rFonts w:ascii="Inter" w:hAnsi="Inter"/>
+                <w:b/>
+                <w:bCs/>
+                <w:sz w:val="20"/>
+                <w:szCs w:val="20"/>
+              </w:rPr>
+              <w:t>How to upload certificates through the E-Sea Mobile App</w:t>
+            </w:r>
+            <w:r>
+              <w:rPr>
+                <w:rFonts w:ascii="Inter" w:hAnsi="Inter"/>
+                <w:b/>
+                <w:bCs/>
+                <w:sz w:val="20"/>
+                <w:szCs w:val="20"/>
+              </w:rPr>
+              <w:br/>
+            </w:r>
+            <w:hyperlink r:id="rId21" w:history="1">
+              <w:r>
+                <w:rPr>
+                  <w:rStyle w:val="Hyperlink"/>
+                  <w:rFonts w:ascii="Inter" w:hAnsi="Inter"/>
+                  <w:sz w:val="20"/>
+                  <w:szCs w:val="20"/>
+                </w:rPr>
+                <w:t>https://youtube.com/watch?v=</w:t>
+              </w:r>
+              <w:r>
+                <w:rPr>
+                  <w:rStyle w:val="Hyperlink"/>
+                  <w:rFonts w:ascii="Inter" w:hAnsi="Inter"/>
+                  <w:sz w:val="20"/>
+                  <w:szCs w:val="20"/>
+                </w:rPr>
+                <w:t>A</w:t>
+              </w:r>
+              <w:r>
+                <w:rPr>
+                  <w:rStyle w:val="Hyperlink"/>
+                  <w:rFonts w:ascii="Inter" w:hAnsi="Inter"/>
+                  <w:sz w:val="20"/>
+                  <w:szCs w:val="20"/>
+                </w:rPr>
+                <w:t>M1zNu8hqFw</w:t>
+              </w:r>
+            </w:hyperlink>
+          </w:p>
+          <w:p>
+            <w:pPr>
+              <w:pStyle w:val="ListParagraph"/>
+              <w:rPr>
+                <w:rFonts w:ascii="Inter" w:hAnsi="Inter"/>
+                <w:sz w:val="20"/>
+                <w:szCs w:val="20"/>
+              </w:rPr>
+            </w:pPr>
           </w:p>
           <w:p>
             <w:pPr>
@@ -7046,7 +7305,6 @@
   <w:style w:type="character" w:default="1" w:styleId="DefaultParagraphFont">
     <w:name w:val="Default Paragraph Font"/>
     <w:uiPriority w:val="1"/>
-    <w:semiHidden/>
     <w:unhideWhenUsed/>
   </w:style>
   <w:style w:type="table" w:default="1" w:styleId="TableNormal">
@@ -7402,6 +7660,18 @@
       <w:shd w:val="clear" w:color="auto" w:fill="E1DFDD"/>
     </w:rPr>
   </w:style>
+  <w:style w:type="character" w:styleId="FollowedHyperlink">
+    <w:name w:val="FollowedHyperlink"/>
+    <w:basedOn w:val="DefaultParagraphFont"/>
+    <w:uiPriority w:val="99"/>
+    <w:semiHidden/>
+    <w:unhideWhenUsed/>
+    <w:rsid w:val="001218A1"/>
+    <w:rPr>
+      <w:color w:val="96607D" w:themeColor="followedHyperlink"/>
+      <w:u w:val="single"/>
+    </w:rPr>
+  </w:style>
 </w:styles>
 </file>
 

</xml_diff>

<commit_message>
Deploying to gh-pages from @ rhenoa24/Resume2025@1b89610fd3c3fab4b342a572bab9ba2d1e2197a4 🚀
</commit_message>
<xml_diff>
--- a/Bautista_Resume_2025.docx
+++ b/Bautista_Resume_2025.docx
@@ -1225,29 +1225,7 @@
                 <w:sz w:val="18"/>
                 <w:szCs w:val="18"/>
               </w:rPr>
-              <w:t xml:space="preserve">Camtasia, </w:t>
-            </w:r>
-            <w:proofErr w:type="spellStart"/>
-            <w:r>
-              <w:rPr>
-                <w:rFonts w:ascii="Inter" w:hAnsi="Inter"/>
-                <w:i/>
-                <w:iCs/>
-                <w:sz w:val="18"/>
-                <w:szCs w:val="18"/>
-              </w:rPr>
-              <w:t>CapCut</w:t>
-            </w:r>
-            <w:proofErr w:type="spellEnd"/>
-            <w:r>
-              <w:rPr>
-                <w:rFonts w:ascii="Inter" w:hAnsi="Inter"/>
-                <w:i/>
-                <w:iCs/>
-                <w:sz w:val="18"/>
-                <w:szCs w:val="18"/>
-              </w:rPr>
-              <w:t xml:space="preserve">, </w:t>
+              <w:t xml:space="preserve">Camtasia, CapCut, </w:t>
             </w:r>
             <w:proofErr w:type="spellStart"/>
             <w:r>
@@ -1711,7 +1689,23 @@
                 <w:sz w:val="20"/>
                 <w:szCs w:val="20"/>
               </w:rPr>
-              <w:t xml:space="preserve"> with 3 years of experience</w:t>
+              <w:t xml:space="preserve"> with 3</w:t>
+            </w:r>
+            <w:r>
+              <w:rPr>
+                <w:rFonts w:ascii="Inter" w:hAnsi="Inter"/>
+                <w:sz w:val="20"/>
+                <w:szCs w:val="20"/>
+              </w:rPr>
+              <w:t>+</w:t>
+            </w:r>
+            <w:r>
+              <w:rPr>
+                <w:rFonts w:ascii="Inter" w:hAnsi="Inter"/>
+                <w:sz w:val="20"/>
+                <w:szCs w:val="20"/>
+              </w:rPr>
+              <w:t xml:space="preserve"> years of experience</w:t>
             </w:r>
             <w:r>
               <w:rPr>
@@ -1728,6 +1722,54 @@
                 <w:szCs w:val="20"/>
               </w:rPr>
               <w:t>hybrid UI/UX Engineer and Frontend Developer</w:t>
+            </w:r>
+            <w:r>
+              <w:rPr>
+                <w:rFonts w:ascii="Inter" w:hAnsi="Inter"/>
+                <w:sz w:val="20"/>
+                <w:szCs w:val="20"/>
+              </w:rPr>
+              <w:t>. Along with</w:t>
+            </w:r>
+            <w:r>
+              <w:rPr>
+                <w:rFonts w:ascii="Inter" w:hAnsi="Inter"/>
+                <w:sz w:val="20"/>
+                <w:szCs w:val="20"/>
+              </w:rPr>
+              <w:t xml:space="preserve"> my</w:t>
+            </w:r>
+            <w:r>
+              <w:rPr>
+                <w:rFonts w:ascii="Inter" w:hAnsi="Inter"/>
+                <w:sz w:val="20"/>
+                <w:szCs w:val="20"/>
+              </w:rPr>
+              <w:t xml:space="preserve"> </w:t>
+            </w:r>
+            <w:r>
+              <w:rPr>
+                <w:rFonts w:ascii="Inter" w:hAnsi="Inter"/>
+                <w:sz w:val="20"/>
+                <w:szCs w:val="20"/>
+              </w:rPr>
+              <w:t xml:space="preserve">5+ years of relevant experience in </w:t>
+            </w:r>
+            <w:r>
+              <w:rPr>
+                <w:rFonts w:ascii="Inter" w:hAnsi="Inter"/>
+                <w:sz w:val="20"/>
+                <w:szCs w:val="20"/>
+              </w:rPr>
+              <w:t>D</w:t>
+            </w:r>
+            <w:r>
+              <w:rPr>
+                <w:rFonts w:ascii="Inter" w:hAnsi="Inter"/>
+                <w:sz w:val="20"/>
+                <w:szCs w:val="20"/>
+              </w:rPr>
+              <w:t>esign</w:t>
             </w:r>
             <w:r>
               <w:rPr>
@@ -2627,7 +2669,6 @@
                 <w:sz w:val="20"/>
                 <w:szCs w:val="20"/>
               </w:rPr>
-              <w:lastRenderedPageBreak/>
               <mc:AlternateContent>
                 <mc:Choice Requires="wps">
                   <w:drawing>
@@ -5667,25 +5708,7 @@
                   <w:sz w:val="20"/>
                   <w:szCs w:val="20"/>
                 </w:rPr>
-                <w:t>https://youtube.com/watch?v=</w:t>
-              </w:r>
-              <w:r>
-                <w:rPr>
-                  <w:rStyle w:val="Hyperlink"/>
-                  <w:rFonts w:ascii="Inter" w:hAnsi="Inter"/>
-                  <w:sz w:val="20"/>
-                  <w:szCs w:val="20"/>
-                </w:rPr>
-                <w:t>A</w:t>
-              </w:r>
-              <w:r>
-                <w:rPr>
-                  <w:rStyle w:val="Hyperlink"/>
-                  <w:rFonts w:ascii="Inter" w:hAnsi="Inter"/>
-                  <w:sz w:val="20"/>
-                  <w:szCs w:val="20"/>
-                </w:rPr>
-                <w:t>M1zNu8hqFw</w:t>
+                <w:t>https://youtube.com/watch?v=AM1zNu8hqFw</w:t>
               </w:r>
             </w:hyperlink>
           </w:p>
@@ -7305,6 +7328,7 @@
   <w:style w:type="character" w:default="1" w:styleId="DefaultParagraphFont">
     <w:name w:val="Default Paragraph Font"/>
     <w:uiPriority w:val="1"/>
+    <w:semiHidden/>
     <w:unhideWhenUsed/>
   </w:style>
   <w:style w:type="table" w:default="1" w:styleId="TableNormal">

</xml_diff>

<commit_message>
Deploying to gh-pages from @ rhenoa24/Resume2025@afe50a7c8152433ccc6b88b7090a7aefae09b084 🚀
</commit_message>
<xml_diff>
--- a/Bautista_Resume_2025.docx
+++ b/Bautista_Resume_2025.docx
@@ -1753,7 +1753,15 @@
                 <w:sz w:val="20"/>
                 <w:szCs w:val="20"/>
               </w:rPr>
-              <w:t xml:space="preserve">5+ years of relevant experience in </w:t>
+              <w:t>6</w:t>
+            </w:r>
+            <w:r>
+              <w:rPr>
+                <w:rFonts w:ascii="Inter" w:hAnsi="Inter"/>
+                <w:sz w:val="20"/>
+                <w:szCs w:val="20"/>
+              </w:rPr>
+              <w:t xml:space="preserve">+ years of relevant experience in </w:t>
             </w:r>
             <w:r>
               <w:rPr>

</xml_diff>